<commit_message>
Add GI Word numbering, public Generate API, and integration docs.
Fix concern/investigation/closing list numIds for Word-edited templates, support case.issues and header placeholders, and ship reference-template plus README for library consumers.

Co-authored-by: Cursor <cursoragent@cursor.com>
</commit_message>
<xml_diff>
--- a/templates/template.docx
+++ b/templates/template.docx
@@ -1,111 +1,430 @@
 
 <file path=word/document.xml><?xml version="1.0" encoding="utf-8"?>
-<w:document xmlns:w15="http://schemas.microsoft.com/office/word/2012/wordml" xmlns:w="http://schemas.openxmlformats.org/wordprocessingml/2006/main" xmlns:wp="http://schemas.openxmlformats.org/drawingml/2006/wordprocessingDrawing" xmlns:wp14="http://schemas.microsoft.com/office/word/2010/wordprocessingDrawing" xmlns:w14="http://schemas.microsoft.com/office/word/2010/wordml" xmlns:o="urn:schemas-microsoft-com:office:office" xmlns:r="http://schemas.openxmlformats.org/officeDocument/2006/relationships" xmlns:v="urn:schemas-microsoft-com:vml" xmlns:w10="urn:schemas-microsoft-com:office:word" xmlns:wps="http://schemas.microsoft.com/office/word/2010/wordprocessingShape" xmlns:wpg="http://schemas.microsoft.com/office/word/2010/wordprocessingGroup" xmlns:mc="http://schemas.openxmlformats.org/markup-compatibility/2006" mc:Ignorable="w14 wp14 w15">
+<w:document xmlns:w10="urn:schemas-microsoft-com:office:word" xmlns:wps="http://schemas.microsoft.com/office/word/2010/wordprocessingShape" xmlns:mc="http://schemas.openxmlformats.org/markup-compatibility/2006" xmlns:w15="http://schemas.microsoft.com/office/word/2012/wordml" xmlns:w="http://schemas.openxmlformats.org/wordprocessingml/2006/main" xmlns:r="http://schemas.openxmlformats.org/officeDocument/2006/relationships" xmlns:v="urn:schemas-microsoft-com:vml" xmlns:wp="http://schemas.openxmlformats.org/drawingml/2006/wordprocessingDrawing" xmlns:wpg="http://schemas.microsoft.com/office/word/2010/wordprocessingGroup" xmlns:wp14="http://schemas.microsoft.com/office/word/2010/wordprocessingDrawing" xmlns:w14="http://schemas.microsoft.com/office/word/2010/wordml" xmlns:o="urn:schemas-microsoft-com:office:office" mc:Ignorable="w14 wp14 w15">
   <w:body>
     <w:p>
-      <w:pPr>
-        <w:pStyle w:val="Heading1"/>
-      </w:pPr>
       <w:r>
-        <w:t>{Report.Title}</w:t>
+        <w:t>GROUP INVESTIGATION</w:t>
       </w:r>
     </w:p>
     <w:p>
       <w:r>
-        <w:t>Report date: {Report.Date} | Prepared by: {Summary.Author}</w:t>
+        <w:t>DRAFT: {draftDate} – the date of the report</w:t>
+      </w:r>
+    </w:p>
+    <w:p>
+      <w:r>
+        <w:t>PROJECT {projectName}</w:t>
+      </w:r>
+    </w:p>
+    <w:p>
+      <w:r>
+        <w:t>{case.name}</w:t>
+      </w:r>
+    </w:p>
+    <w:p>
+      <w:r>
+        <w:rPr>
+          <w:b/>
+        </w:rPr>
+        <w:t>EXECUTIVE SUMMARY</w:t>
+      </w:r>
+    </w:p>
+    <w:p>
+      <w:r>
+        <w:t>Accountable Executive: {accountableExecutive}</w:t>
       </w:r>
     </w:p>
     <w:p>
       <w:pPr>
-        <w:pStyle w:val="Heading1"/>
+        <w:numPr>
+          <w:ilvl w:val="1"/>
+          <w:numId w:val="3"/>
+        </w:numPr>
       </w:pPr>
       <w:r>
-        <w:t>1. Summary</w:t>
+        <w:t> Group Investigations ('GI') reviewed concerns involving {subjectList}:</w:t>
       </w:r>
     </w:p>
     <w:p>
       <w:r>
-        <w:t>{Summary.Overview}</w:t>
+        <w:t>{BEGIN:case.issues}</w:t>
       </w:r>
     </w:p>
     <w:p>
       <w:pPr>
-        <w:pStyle w:val="Heading2"/>
+        <w:numPr>
+          <w:ilvl w:val="0"/>
+          <w:numId w:val="1"/>
+        </w:numPr>
       </w:pPr>
       <w:r>
-        <w:t>Issue titles</w:t>
+        <w:t>Concern {issue.listIndex}: {issue.brief}</w:t>
       </w:r>
     </w:p>
     <w:p>
       <w:r>
-        <w:t>{BEGIN_ISSUE_LIST}</w:t>
+        <w:t>{END:case.issues}</w:t>
+      </w:r>
+    </w:p>
+    <w:p>
+      <w:pPr>
+        <w:numPr>
+          <w:ilvl w:val="1"/>
+          <w:numId w:val="3"/>
+        </w:numPr>
+      </w:pPr>
+      <w:r>
+        <w:t> The review identified that {executiveSummary.identified}</w:t>
+      </w:r>
+    </w:p>
+    <w:p>
+      <w:pPr>
+        <w:numPr>
+          <w:ilvl w:val="1"/>
+          <w:numId w:val="3"/>
+        </w:numPr>
+      </w:pPr>
+      <w:r>
+        <w:t> The concern that {executiveSummary.concernRef} was {executiveSummary.substantiation}. The evidence {executiveSummary.evidence} ...</w:t>
+      </w:r>
+    </w:p>
+    <w:p>
+      <w:pPr>
+        <w:numPr>
+          <w:ilvl w:val="1"/>
+          <w:numId w:val="3"/>
+        </w:numPr>
+      </w:pPr>
+      <w:r>
+        <w:t> Recommendations {executiveSummary.recommendations}</w:t>
       </w:r>
     </w:p>
     <w:p>
       <w:r>
-        <w:t>• {Record.Title}</w:t>
+        <w:rPr>
+          <w:b/>
+        </w:rPr>
+        <w:t>INVESTIGATION REPORT</w:t>
       </w:r>
     </w:p>
     <w:p>
       <w:r>
-        <w:t>{END_ISSUE_LIST}</w:t>
+        <w:rPr>
+          <w:b/>
+        </w:rPr>
+        <w:t>1. BACKGROUND</w:t>
+      </w:r>
+    </w:p>
+    <w:p>
+      <w:pPr>
+        <w:numPr>
+          <w:ilvl w:val="1"/>
+          <w:numId w:val="4"/>
+        </w:numPr>
+      </w:pPr>
+      <w:r>
+        <w:t> In {background.period}, concerns were escalated to GI that {subjectList}:</w:t>
       </w:r>
     </w:p>
     <w:p>
       <w:r>
-        <w:t>{BEGIN_RECORD}</w:t>
+        <w:t>{BEGIN:case.issues:background}</w:t>
       </w:r>
     </w:p>
     <w:p>
       <w:pPr>
-        <w:pStyle w:val="Heading1"/>
+        <w:numPr>
+          <w:ilvl w:val="0"/>
+          <w:numId w:val="2"/>
+        </w:numPr>
       </w:pPr>
       <w:r>
-        <w:t>{Record.NumberedTitle}</w:t>
+        <w:t>Concern {issue.listIndex}: {issue.brief}</w:t>
+      </w:r>
+    </w:p>
+    <w:p>
+      <w:r>
+        <w:t>{END:case.issues:background}</w:t>
+      </w:r>
+    </w:p>
+    <w:p>
+      <w:r>
+        <w:t>(collectively, the 'Concerns')</w:t>
+      </w:r>
+    </w:p>
+    <w:p>
+      <w:r>
+        <w:rPr>
+          <w:b/>
+        </w:rPr>
+        <w:t>2. INVESTIGATION METHODOLOGY</w:t>
       </w:r>
     </w:p>
     <w:p>
       <w:pPr>
-        <w:pStyle w:val="Heading2"/>
+        <w:numPr>
+          <w:ilvl w:val="1"/>
+          <w:numId w:val="5"/>
+        </w:numPr>
       </w:pPr>
       <w:r>
-        <w:t>Category</w:t>
+        <w:t> GI applied the following data review parameters to investigate the Concerns:</w:t>
       </w:r>
     </w:p>
     <w:p>
       <w:r>
-        <w:t>{Record.Category}</w:t>
+        <w:t>a. Custodians: ...</w:t>
+      </w:r>
+    </w:p>
+    <w:p>
+      <w:r>
+        <w:t>b. Data Reviewed: ...</w:t>
+      </w:r>
+    </w:p>
+    <w:p>
+      <w:r>
+        <w:t>c. Review Period: ...</w:t>
       </w:r>
     </w:p>
     <w:p>
       <w:pPr>
-        <w:pStyle w:val="Heading2"/>
+        <w:numPr>
+          <w:ilvl w:val="1"/>
+          <w:numId w:val="5"/>
+        </w:numPr>
       </w:pPr>
       <w:r>
-        <w:t>Impact</w:t>
+        <w:t> As a limitation, GI did not ...</w:t>
       </w:r>
     </w:p>
     <w:p>
       <w:r>
-        <w:t>Fixed narrative text for this issue. Replace in Word as needed; no token required.</w:t>
+        <w:t>{BEGIN:case.issues:record}</w:t>
       </w:r>
     </w:p>
     <w:p>
       <w:pPr>
-        <w:pStyle w:val="Heading3"/>
+        <w:numPr>
+          <w:ilvl w:val="0"/>
+          <w:numId w:val="6"/>
+        </w:numPr>
       </w:pPr>
       <w:r>
-        <w:t>Next steps</w:t>
+        <w:rPr>
+          <w:b/>
+        </w:rPr>
+        <w:t>INVESTIGATION: {issue.title}</w:t>
       </w:r>
     </w:p>
     <w:p>
       <w:r>
-        <w:t>Fixed checklist content preserved on each loop iteration.</w:t>
+        <w:t>Optional heading token: {issue.numberedTitle}</w:t>
       </w:r>
     </w:p>
     <w:p>
       <w:r>
-        <w:t>{END_RECORD}</w:t>
+        <w:t>Concern: {issue.summary}</w:t>
+      </w:r>
+    </w:p>
+    <w:p>
+      <w:pPr>
+        <w:numPr>
+          <w:ilvl w:val="1"/>
+          <w:numId w:val="5"/>
+        </w:numPr>
+      </w:pPr>
+      <w:r>
+        <w:t> [facts or evidence identified, grouped by procedures performed or data type].</w:t>
+      </w:r>
+    </w:p>
+    <w:p>
+      <w:r>
+        <w:t>Review of Communication Record</w:t>
+      </w:r>
+    </w:p>
+    <w:p>
+      <w:pPr>
+        <w:numPr>
+          <w:ilvl w:val="1"/>
+          <w:numId w:val="5"/>
+        </w:numPr>
+      </w:pPr>
+      <w:r>
+        <w:t> Review of the Teams chats of the Relevant Colleague identified the following:</w:t>
+      </w:r>
+    </w:p>
+    <w:p>
+      <w:r>
+        <w:t>...</w:t>
+      </w:r>
+    </w:p>
+    <w:p>
+      <w:r>
+        <w:t>Colleague Interviews</w:t>
+      </w:r>
+    </w:p>
+    <w:p>
+      <w:pPr>
+        <w:numPr>
+          <w:ilvl w:val="1"/>
+          <w:numId w:val="5"/>
+        </w:numPr>
+      </w:pPr>
+      <w:r>
+        <w:t> Colleague A stated that:</w:t>
+      </w:r>
+    </w:p>
+    <w:p>
+      <w:pPr>
+        <w:numPr>
+          <w:ilvl w:val="0"/>
+          <w:numId w:val="9"/>
+        </w:numPr>
+      </w:pPr>
+      <w:r>
+        <w:t> {issue.stmtLabelA}. [key interview statements].</w:t>
+      </w:r>
+    </w:p>
+    <w:p>
+      <w:pPr>
+        <w:numPr>
+          <w:ilvl w:val="1"/>
+          <w:numId w:val="5"/>
+        </w:numPr>
+      </w:pPr>
+      <w:r>
+        <w:t> Colleague B stated that:</w:t>
+      </w:r>
+    </w:p>
+    <w:p>
+      <w:pPr>
+        <w:numPr>
+          <w:ilvl w:val="0"/>
+          <w:numId w:val="9"/>
+        </w:numPr>
+      </w:pPr>
+      <w:r>
+        <w:t> {issue.stmtLabelB}. [key interview statements].</w:t>
+      </w:r>
+    </w:p>
+    <w:p>
+      <w:r>
+        <w:t>Findings</w:t>
+      </w:r>
+    </w:p>
+    <w:p>
+      <w:pPr>
+        <w:numPr>
+          <w:ilvl w:val="1"/>
+          <w:numId w:val="5"/>
+        </w:numPr>
+      </w:pPr>
+      <w:r>
+        <w:t> Concern {issue.listIndex} was [not / substantiated] ...</w:t>
+      </w:r>
+    </w:p>
+    <w:p>
+      <w:r>
+        <w:t>{END:case.issues:record}</w:t>
+      </w:r>
+    </w:p>
+    <w:p>
+      <w:pPr>
+        <w:numPr>
+          <w:ilvl w:val="0"/>
+          <w:numId w:val="7"/>
+        </w:numPr>
+      </w:pPr>
+      <w:r>
+        <w:rPr>
+          <w:b/>
+        </w:rPr>
+        <w:t>CONCLUSION</w:t>
+      </w:r>
+    </w:p>
+    <w:p>
+      <w:r>
+        <w:t>Chapter number (auto): {Conclusion.Number}</w:t>
+      </w:r>
+    </w:p>
+    <w:p>
+      <w:pPr>
+        <w:numPr>
+          <w:ilvl w:val="1"/>
+          <w:numId w:val="5"/>
+        </w:numPr>
+      </w:pPr>
+      <w:r>
+        <w:t> Accordingly, the evidence supports that {conclusion.support}</w:t>
+      </w:r>
+    </w:p>
+    <w:p>
+      <w:pPr>
+        <w:numPr>
+          <w:ilvl w:val="0"/>
+          <w:numId w:val="9"/>
+        </w:numPr>
+      </w:pPr>
+      <w:r>
+        <w:t> {conclusion.policyBreaches}</w:t>
+      </w:r>
+    </w:p>
+    <w:p>
+      <w:pPr>
+        <w:numPr>
+          <w:ilvl w:val="0"/>
+          <w:numId w:val="8"/>
+        </w:numPr>
+      </w:pPr>
+      <w:r>
+        <w:rPr>
+          <w:b/>
+        </w:rPr>
+        <w:t>RECOMMENDATIONS</w:t>
+      </w:r>
+    </w:p>
+    <w:p>
+      <w:r>
+        <w:t>Chapter number (auto): {Recommendations.Number}</w:t>
+      </w:r>
+    </w:p>
+    <w:p>
+      <w:pPr>
+        <w:numPr>
+          <w:ilvl w:val="1"/>
+          <w:numId w:val="5"/>
+        </w:numPr>
+      </w:pPr>
+      <w:r>
+        <w:t> {recommendation.1}</w:t>
+      </w:r>
+    </w:p>
+    <w:p>
+      <w:pPr>
+        <w:numPr>
+          <w:ilvl w:val="1"/>
+          <w:numId w:val="5"/>
+        </w:numPr>
+      </w:pPr>
+      <w:r>
+        <w:t> {recommendation.2}</w:t>
+      </w:r>
+    </w:p>
+    <w:p>
+      <w:pPr>
+        <w:numPr>
+          <w:ilvl w:val="1"/>
+          <w:numId w:val="5"/>
+        </w:numPr>
+      </w:pPr>
+      <w:r>
+        <w:t> {recommendation.3}</w:t>
+      </w:r>
+    </w:p>
+    <w:p>
+      <w:r>
+        <w:t>GROUP INVESTIGATIONS</w:t>
       </w:r>
     </w:p>
     <w:sectPr>
@@ -122,211 +441,118 @@
 <w:hdr xmlns:w="http://schemas.openxmlformats.org/wordprocessingml/2006/main" xmlns:r="http://schemas.openxmlformats.org/officeDocument/2006/relationships">
   <w:p>
     <w:r>
-      <w:t>{Report.Title} | {Report.GeneratedAt}</w:t>
+      <w:rPr>
+        <w:color w:val="FF0000"/>
+      </w:rPr>
+      <w:t>CONFIDENTIAL</w:t>
+    </w:r>
+  </w:p>
+  <w:p>
+    <w:r>
+      <w:t>{projectName} | {case.name} | DRAFT: {draftDate}</w:t>
     </w:r>
   </w:p>
 </w:hdr>
 </file>
 
 <file path=word/numbering.xml><?xml version="1.0" encoding="utf-8"?>
-<w:numbering xmlns:wpc="http://schemas.microsoft.com/office/word/2010/wordprocessingCanvas" xmlns:mo="http://schemas.microsoft.com/office/mac/office/2008/main" xmlns:mc="http://schemas.openxmlformats.org/markup-compatibility/2006" xmlns:mv="urn:schemas-microsoft-com:mac:vml" xmlns:o="urn:schemas-microsoft-com:office:office" xmlns:r="http://schemas.openxmlformats.org/officeDocument/2006/relationships" xmlns:m="http://schemas.openxmlformats.org/officeDocument/2006/math" xmlns:v="urn:schemas-microsoft-com:vml" xmlns:wp14="http://schemas.microsoft.com/office/word/2010/wordprocessingDrawing" xmlns:wp="http://schemas.openxmlformats.org/drawingml/2006/wordprocessingDrawing" xmlns:w10="urn:schemas-microsoft-com:office:word" xmlns:w="http://schemas.openxmlformats.org/wordprocessingml/2006/main" xmlns:w14="http://schemas.microsoft.com/office/word/2010/wordml" xmlns:wpg="http://schemas.microsoft.com/office/word/2010/wordprocessingGroup" xmlns:wpi="http://schemas.microsoft.com/office/word/2010/wordprocessingInk" xmlns:wne="http://schemas.microsoft.com/office/word/2006/wordml" xmlns:wps="http://schemas.microsoft.com/office/word/2010/wordprocessingShape" mc:Ignorable="w14 wp14">
+<w:numbering xmlns:w="http://schemas.openxmlformats.org/wordprocessingml/2006/main">
   <w:abstractNum w:abstractNumId="0">
-    <w:nsid w:val="FFFFFF7C"/>
-    <w:multiLevelType w:val="singleLevel"/>
-    <w:tmpl w:val="C310EC42"/>
+    <w:lvl w:ilvl="0">
+      <w:start w:val="1"/>
+      <w:numFmt w:val="lowerLetter"/>
+      <w:lvlText w:val="%1."/>
+      <w:lvlJc w:val="left"/>
+      <w:pPr>
+        <w:ind w:left="720" w:hanging="360"/>
+      </w:pPr>
+    </w:lvl>
+  </w:abstractNum>
+  <w:abstractNum w:abstractNumId="1">
     <w:lvl w:ilvl="0">
       <w:start w:val="1"/>
       <w:numFmt w:val="decimal"/>
       <w:lvlText w:val="%1."/>
       <w:lvlJc w:val="left"/>
       <w:pPr>
-        <w:tabs>
-          <w:tab w:val="num" w:pos="1800"/>
-        </w:tabs>
-        <w:ind w:left="1800" w:hanging="360"/>
+        <w:ind w:left="0" w:hanging="0"/>
       </w:pPr>
     </w:lvl>
-  </w:abstractNum>
-  <w:abstractNum w:abstractNumId="1">
-    <w:nsid w:val="FFFFFF7D"/>
-    <w:multiLevelType w:val="singleLevel"/>
-    <w:tmpl w:val="E4089024"/>
-    <w:lvl w:ilvl="0">
+    <w:lvl w:ilvl="1">
       <w:start w:val="1"/>
       <w:numFmt w:val="decimal"/>
-      <w:lvlText w:val="%1."/>
+      <w:lvlText w:val="%1.%2."/>
       <w:lvlJc w:val="left"/>
       <w:pPr>
-        <w:tabs>
-          <w:tab w:val="num" w:pos="1440"/>
-        </w:tabs>
-        <w:ind w:left="1440" w:hanging="360"/>
-      </w:pPr>
-    </w:lvl>
-  </w:abstractNum>
-  <w:abstractNum w:abstractNumId="2">
-    <w:nsid w:val="FFFFFF7E"/>
-    <w:multiLevelType w:val="singleLevel"/>
-    <w:tmpl w:val="FB12693A"/>
-    <w:lvl w:ilvl="0">
-      <w:start w:val="1"/>
-      <w:numFmt w:val="decimal"/>
-      <w:pStyle w:val="ListNumber3"/>
-      <w:lvlText w:val="%1."/>
-      <w:lvlJc w:val="left"/>
-      <w:pPr>
-        <w:tabs>
-          <w:tab w:val="num" w:pos="1080"/>
-        </w:tabs>
-        <w:ind w:left="1080" w:hanging="360"/>
-      </w:pPr>
-    </w:lvl>
-  </w:abstractNum>
-  <w:abstractNum w:abstractNumId="3">
-    <w:nsid w:val="FFFFFF7F"/>
-    <w:multiLevelType w:val="singleLevel"/>
-    <w:tmpl w:val="38441652"/>
-    <w:lvl w:ilvl="0">
-      <w:start w:val="1"/>
-      <w:numFmt w:val="decimal"/>
-      <w:pStyle w:val="ListNumber2"/>
-      <w:lvlText w:val="%1."/>
-      <w:lvlJc w:val="left"/>
-      <w:pPr>
-        <w:tabs>
-          <w:tab w:val="num" w:pos="720"/>
-        </w:tabs>
         <w:ind w:left="720" w:hanging="360"/>
       </w:pPr>
     </w:lvl>
   </w:abstractNum>
-  <w:abstractNum w:abstractNumId="4">
-    <w:nsid w:val="FFFFFF81"/>
-    <w:multiLevelType w:val="singleLevel"/>
-    <w:tmpl w:val="171AC3A4"/>
-    <w:lvl w:ilvl="0">
-      <w:start w:val="1"/>
-      <w:numFmt w:val="bullet"/>
-      <w:lvlText w:val=""/>
-      <w:lvlJc w:val="left"/>
-      <w:pPr>
-        <w:tabs>
-          <w:tab w:val="num" w:pos="1440"/>
-        </w:tabs>
-        <w:ind w:left="1440" w:hanging="360"/>
-      </w:pPr>
-      <w:rPr>
-        <w:rFonts w:ascii="Symbol" w:hAnsi="Symbol" w:hint="default"/>
-      </w:rPr>
-    </w:lvl>
-  </w:abstractNum>
-  <w:abstractNum w:abstractNumId="5">
-    <w:nsid w:val="FFFFFF82"/>
-    <w:multiLevelType w:val="singleLevel"/>
-    <w:tmpl w:val="F3EAFDEC"/>
-    <w:lvl w:ilvl="0">
-      <w:start w:val="1"/>
-      <w:numFmt w:val="bullet"/>
-      <w:pStyle w:val="ListBullet3"/>
-      <w:lvlText w:val=""/>
-      <w:lvlJc w:val="left"/>
-      <w:pPr>
-        <w:tabs>
-          <w:tab w:val="num" w:pos="1080"/>
-        </w:tabs>
-        <w:ind w:left="1080" w:hanging="360"/>
-      </w:pPr>
-      <w:rPr>
-        <w:rFonts w:ascii="Symbol" w:hAnsi="Symbol" w:hint="default"/>
-      </w:rPr>
-    </w:lvl>
-  </w:abstractNum>
-  <w:abstractNum w:abstractNumId="6">
-    <w:nsid w:val="FFFFFF83"/>
-    <w:multiLevelType w:val="singleLevel"/>
-    <w:tmpl w:val="3D1EFFD4"/>
-    <w:lvl w:ilvl="0">
-      <w:start w:val="1"/>
-      <w:numFmt w:val="bullet"/>
-      <w:pStyle w:val="ListBullet2"/>
-      <w:lvlText w:val=""/>
-      <w:lvlJc w:val="left"/>
-      <w:pPr>
-        <w:tabs>
-          <w:tab w:val="num" w:pos="720"/>
-        </w:tabs>
-        <w:ind w:left="720" w:hanging="360"/>
-      </w:pPr>
-      <w:rPr>
-        <w:rFonts w:ascii="Symbol" w:hAnsi="Symbol" w:hint="default"/>
-      </w:rPr>
-    </w:lvl>
-  </w:abstractNum>
-  <w:abstractNum w:abstractNumId="7">
-    <w:nsid w:val="FFFFFF88"/>
-    <w:multiLevelType w:val="singleLevel"/>
-    <w:tmpl w:val="D0A62B40"/>
-    <w:lvl w:ilvl="0">
-      <w:start w:val="1"/>
-      <w:numFmt w:val="decimal"/>
-      <w:pStyle w:val="ListNumber"/>
-      <w:lvlText w:val="%1."/>
-      <w:lvlJc w:val="left"/>
-      <w:pPr>
-        <w:tabs>
-          <w:tab w:val="num" w:pos="360"/>
-        </w:tabs>
-        <w:ind w:left="360" w:hanging="360"/>
-      </w:pPr>
-    </w:lvl>
-  </w:abstractNum>
-  <w:abstractNum w:abstractNumId="8">
-    <w:nsid w:val="FFFFFF89"/>
-    <w:multiLevelType w:val="singleLevel"/>
-    <w:tmpl w:val="29761A62"/>
-    <w:lvl w:ilvl="0">
-      <w:start w:val="1"/>
-      <w:numFmt w:val="bullet"/>
-      <w:pStyle w:val="ListBullet"/>
-      <w:lvlText w:val=""/>
-      <w:lvlJc w:val="left"/>
-      <w:pPr>
-        <w:tabs>
-          <w:tab w:val="num" w:pos="360"/>
-        </w:tabs>
-        <w:ind w:left="360" w:hanging="360"/>
-      </w:pPr>
-      <w:rPr>
-        <w:rFonts w:ascii="Symbol" w:hAnsi="Symbol" w:hint="default"/>
-      </w:rPr>
-    </w:lvl>
-  </w:abstractNum>
   <w:num w:numId="1">
-    <w:abstractNumId w:val="8"/>
+    <w:abstractNumId w:val="0"/>
   </w:num>
   <w:num w:numId="2">
-    <w:abstractNumId w:val="6"/>
+    <w:abstractNumId w:val="0"/>
+    <w:lvlOverride w:ilvl="0">
+      <w:startOverride w:val="1"/>
+    </w:lvlOverride>
   </w:num>
   <w:num w:numId="3">
-    <w:abstractNumId w:val="5"/>
+    <w:abstractNumId w:val="1"/>
+    <w:lvlOverride w:ilvl="0">
+      <w:startOverride w:val="1"/>
+    </w:lvlOverride>
   </w:num>
   <w:num w:numId="4">
-    <w:abstractNumId w:val="4"/>
+    <w:abstractNumId w:val="1"/>
+    <w:lvlOverride w:ilvl="0">
+      <w:startOverride w:val="1"/>
+    </w:lvlOverride>
+    <w:lvlOverride w:ilvl="1">
+      <w:startOverride w:val="1"/>
+    </w:lvlOverride>
   </w:num>
   <w:num w:numId="5">
-    <w:abstractNumId w:val="7"/>
+    <w:abstractNumId w:val="1"/>
+    <w:lvlOverride w:ilvl="0">
+      <w:startOverride w:val="2"/>
+    </w:lvlOverride>
+    <w:lvlOverride w:ilvl="1">
+      <w:startOverride w:val="1"/>
+    </w:lvlOverride>
   </w:num>
   <w:num w:numId="6">
-    <w:abstractNumId w:val="3"/>
+    <w:abstractNumId w:val="1"/>
+    <w:lvlOverride w:ilvl="0">
+      <w:startOverride w:val="3"/>
+    </w:lvlOverride>
+    <w:lvlOverride w:ilvl="1">
+      <w:startOverride w:val="1"/>
+    </w:lvlOverride>
   </w:num>
   <w:num w:numId="7">
-    <w:abstractNumId w:val="2"/>
+    <w:abstractNumId w:val="1"/>
+    <w:lvlOverride w:ilvl="0">
+      <w:startOverride w:val="8"/>
+    </w:lvlOverride>
+    <w:lvlOverride w:ilvl="1">
+      <w:startOverride w:val="1"/>
+    </w:lvlOverride>
   </w:num>
   <w:num w:numId="8">
     <w:abstractNumId w:val="1"/>
+    <w:lvlOverride w:ilvl="0">
+      <w:startOverride w:val="9"/>
+    </w:lvlOverride>
+    <w:lvlOverride w:ilvl="1">
+      <w:startOverride w:val="1"/>
+    </w:lvlOverride>
   </w:num>
   <w:num w:numId="9">
     <w:abstractNumId w:val="0"/>
+    <w:lvlOverride w:ilvl="0">
+      <w:startOverride w:val="1"/>
+    </w:lvlOverride>
   </w:num>
 </w:numbering>
 </file>

</xml_diff>